<commit_message>
Fix hugo.toml duplicate markup table; consolidate satire docx and add images
</commit_message>
<xml_diff>
--- a/content/muser/satire/asset-code-on-staff/index.docx
+++ b/content/muser/satire/asset-code-on-staff/index.docx
@@ -25,9 +25,6 @@
       </w:r>
     </w:p>
     <w:p>
-      <w:pPr>
-        <w:pStyle w:val="Heading2"/>
-      </w:pPr>
       <w:r>
         <w:t>Your Actual Top Technical Performers Should Be Asset Tagged and Added to the Asset List</w:t>
       </w:r>
@@ -62,9 +59,6 @@
       </w:r>
     </w:p>
     <w:p>
-      <w:pPr>
-        <w:pStyle w:val="Heading3"/>
-      </w:pPr>
       <w:r>
         <w:t>Why Treat Them Like Humans When You Can Treat Them Like Assets?</w:t>
       </w:r>
@@ -97,9 +91,6 @@
       </w:r>
     </w:p>
     <w:p>
-      <w:pPr>
-        <w:pStyle w:val="Heading3"/>
-      </w:pPr>
       <w:r>
         <w:t>Introducing the Human Asset Tagging Program (HATP™)</w:t>
       </w:r>
@@ -126,9 +117,6 @@
       </w:r>
     </w:p>
     <w:p>
-      <w:pPr>
-        <w:pStyle w:val="Heading3"/>
-      </w:pPr>
       <w:r>
         <w:t>The CMMS Needs a New Category: “Human Assets”</w:t>
       </w:r>
@@ -151,9 +139,6 @@
       </w:r>
     </w:p>
     <w:p>
-      <w:pPr>
-        <w:pStyle w:val="Heading3"/>
-      </w:pPr>
       <w:r>
         <w:t>Routine Maintenance for Human Assets</w:t>
       </w:r>
@@ -184,9 +169,6 @@
       </w:r>
     </w:p>
     <w:p>
-      <w:pPr>
-        <w:pStyle w:val="Heading3"/>
-      </w:pPr>
       <w:r>
         <w:t>Human Asset Depreciation</w:t>
       </w:r>
@@ -213,9 +195,6 @@
       </w:r>
     </w:p>
     <w:p>
-      <w:pPr>
-        <w:pStyle w:val="Heading3"/>
-      </w:pPr>
       <w:r>
         <w:t>Annual Asset Audit</w:t>
       </w:r>
@@ -238,9 +217,6 @@
       </w:r>
     </w:p>
     <w:p>
-      <w:pPr>
-        <w:pStyle w:val="Heading3"/>
-      </w:pPr>
       <w:r>
         <w:t>Human Asset Warranty</w:t>
       </w:r>
@@ -267,9 +243,6 @@
       </w:r>
     </w:p>
     <w:p>
-      <w:pPr>
-        <w:pStyle w:val="Heading3"/>
-      </w:pPr>
       <w:r>
         <w:t>Conclusion: If They’re Valuable, Tag Them</w:t>
       </w:r>
@@ -305,6 +278,78 @@
         <w:t>They’ll walk out the door.</w:t>
         <w:br/>
         <w:t>And unlike pumps, you can’t order replacements from the OEM.</w:t>
+      </w:r>
+    </w:p>
+    <w:p>
+      <w:r>
+        <w:drawing>
+          <wp:inline xmlns:a="http://schemas.openxmlformats.org/drawingml/2006/main" xmlns:pic="http://schemas.openxmlformats.org/drawingml/2006/picture">
+            <wp:extent cx="4114800" cy="8278105"/>
+            <wp:docPr id="1" name="Picture 1"/>
+            <wp:cNvGraphicFramePr>
+              <a:graphicFrameLocks noChangeAspect="1"/>
+            </wp:cNvGraphicFramePr>
+            <a:graphic>
+              <a:graphicData uri="http://schemas.openxmlformats.org/drawingml/2006/picture">
+                <pic:pic>
+                  <pic:nvPicPr>
+                    <pic:cNvPr id="0" name="forest extended.png"/>
+                    <pic:cNvPicPr/>
+                  </pic:nvPicPr>
+                  <pic:blipFill>
+                    <a:blip r:embed="rId9"/>
+                    <a:stretch>
+                      <a:fillRect/>
+                    </a:stretch>
+                  </pic:blipFill>
+                  <pic:spPr>
+                    <a:xfrm>
+                      <a:off x="0" y="0"/>
+                      <a:ext cx="4114800" cy="8278105"/>
+                    </a:xfrm>
+                    <a:prstGeom prst="rect"/>
+                  </pic:spPr>
+                </pic:pic>
+              </a:graphicData>
+            </a:graphic>
+          </wp:inline>
+        </w:drawing>
+      </w:r>
+    </w:p>
+    <w:p>
+      <w:r>
+        <w:drawing>
+          <wp:inline xmlns:a="http://schemas.openxmlformats.org/drawingml/2006/main" xmlns:pic="http://schemas.openxmlformats.org/drawingml/2006/picture">
+            <wp:extent cx="4114800" cy="4114800"/>
+            <wp:docPr id="2" name="Picture 2"/>
+            <wp:cNvGraphicFramePr>
+              <a:graphicFrameLocks noChangeAspect="1"/>
+            </wp:cNvGraphicFramePr>
+            <a:graphic>
+              <a:graphicData uri="http://schemas.openxmlformats.org/drawingml/2006/picture">
+                <pic:pic>
+                  <pic:nvPicPr>
+                    <pic:cNvPr id="0" name="technicianassetcodethumb.png"/>
+                    <pic:cNvPicPr/>
+                  </pic:nvPicPr>
+                  <pic:blipFill>
+                    <a:blip r:embed="rId10"/>
+                    <a:stretch>
+                      <a:fillRect/>
+                    </a:stretch>
+                  </pic:blipFill>
+                  <pic:spPr>
+                    <a:xfrm>
+                      <a:off x="0" y="0"/>
+                      <a:ext cx="4114800" cy="4114800"/>
+                    </a:xfrm>
+                    <a:prstGeom prst="rect"/>
+                  </pic:spPr>
+                </pic:pic>
+              </a:graphicData>
+            </a:graphic>
+          </wp:inline>
+        </w:drawing>
       </w:r>
     </w:p>
     <w:sectPr>

</xml_diff>